<commit_message>
Add hybrid API support: real API + local fallback
</commit_message>
<xml_diff>
--- a/docs/CS599_大作业报告.docx
+++ b/docs/CS599_大作业报告.docx
@@ -2,6 +2,7 @@
 <file path=word/document.xml><?xml version="1.0" encoding="utf-8"?>
 <w:document xmlns:wpc="http://schemas.microsoft.com/office/word/2010/wordprocessingCanvas" xmlns:mo="http://schemas.microsoft.com/office/mac/office/2008/main" xmlns:mc="http://schemas.openxmlformats.org/markup-compatibility/2006" xmlns:mv="urn:schemas-microsoft-com:mac:vml" xmlns:o="urn:schemas-microsoft-com:office:office" xmlns:r="http://schemas.openxmlformats.org/officeDocument/2006/relationships" xmlns:m="http://schemas.openxmlformats.org/officeDocument/2006/math" xmlns:v="urn:schemas-microsoft-com:vml" xmlns:wp14="http://schemas.microsoft.com/office/word/2010/wordprocessingDrawing" xmlns:wp="http://schemas.openxmlformats.org/drawingml/2006/wordprocessingDrawing" xmlns:w10="urn:schemas-microsoft-com:office:word" xmlns:w="http://schemas.openxmlformats.org/wordprocessingml/2006/main" xmlns:w14="http://schemas.microsoft.com/office/word/2010/wordml" xmlns:wpg="http://schemas.microsoft.com/office/word/2010/wordprocessingGroup" xmlns:wpi="http://schemas.microsoft.com/office/word/2010/wordprocessingInk" xmlns:wne="http://schemas.microsoft.com/office/word/2006/wordml" xmlns:wps="http://schemas.microsoft.com/office/word/2010/wordprocessingShape" mc:Ignorable="w14 wp14">
   <w:body>
+    <w:p/>
     <w:p/>
     <w:p/>
     <w:p/>
@@ -34,13 +35,14 @@
     <w:p/>
     <w:p/>
     <w:p/>
+    <w:p/>
     <w:p>
       <w:pPr>
         <w:jc w:val="center"/>
       </w:pPr>
       <w:r>
         <w:rPr>
-          <w:sz w:val="28"/>
+          <w:sz w:val="26"/>
         </w:rPr>
         <w:t>项目名称：CS599 多智能体旅行规划系统</w:t>
       </w:r>
@@ -51,9 +53,9 @@
       </w:pPr>
       <w:r>
         <w:rPr>
-          <w:sz w:val="28"/>
+          <w:sz w:val="26"/>
         </w:rPr>
-        <w:t>GitHub 仓库：https://github.com/LIyu77/cs599-project</w:t>
+        <w:t>GitHub：https://github.com/LIyu77/cs599-project</w:t>
       </w:r>
     </w:p>
     <w:p>
@@ -62,9 +64,9 @@
       </w:pPr>
       <w:r>
         <w:rPr>
-          <w:sz w:val="28"/>
+          <w:sz w:val="26"/>
         </w:rPr>
-        <w:t>开发环境：Claude Code + 智谱AI</w:t>
+        <w:t>开发环境：Claude Code + 智谱AI (GLM-4)</w:t>
       </w:r>
     </w:p>
     <w:p>
@@ -73,7 +75,7 @@
       </w:pPr>
       <w:r>
         <w:rPr>
-          <w:sz w:val="28"/>
+          <w:sz w:val="26"/>
         </w:rPr>
         <w:t>提交日期：2026年6月</w:t>
       </w:r>
@@ -93,7 +95,7 @@
     </w:p>
     <w:p>
       <w:pPr>
-        <w:spacing w:before="120"/>
+        <w:spacing w:before="160" w:after="80"/>
       </w:pPr>
       <w:r>
         <w:t>一、选题背景与设计思想</w:t>
@@ -101,7 +103,7 @@
     </w:p>
     <w:p>
       <w:pPr>
-        <w:spacing w:before="120"/>
+        <w:spacing w:before="160" w:after="80"/>
       </w:pPr>
       <w:r>
         <w:t>二、Specs 规格文档</w:t>
@@ -109,7 +111,7 @@
     </w:p>
     <w:p>
       <w:pPr>
-        <w:spacing w:before="120"/>
+        <w:spacing w:before="160" w:after="80"/>
       </w:pPr>
       <w:r>
         <w:t>三、系统架构与设计</w:t>
@@ -117,7 +119,7 @@
     </w:p>
     <w:p>
       <w:pPr>
-        <w:spacing w:before="120"/>
+        <w:spacing w:before="160" w:after="80"/>
       </w:pPr>
       <w:r>
         <w:t>四、关键实现与代码展示</w:t>
@@ -125,7 +127,7 @@
     </w:p>
     <w:p>
       <w:pPr>
-        <w:spacing w:before="120"/>
+        <w:spacing w:before="160" w:after="80"/>
       </w:pPr>
       <w:r>
         <w:t>五、测试与评估</w:t>
@@ -133,7 +135,7 @@
     </w:p>
     <w:p>
       <w:pPr>
-        <w:spacing w:before="120"/>
+        <w:spacing w:before="160" w:after="80"/>
       </w:pPr>
       <w:r>
         <w:t>六、系统升级与扩展</w:t>
@@ -141,7 +143,7 @@
     </w:p>
     <w:p>
       <w:pPr>
-        <w:spacing w:before="120"/>
+        <w:spacing w:before="160" w:after="80"/>
       </w:pPr>
       <w:r>
         <w:t>七、课程总结</w:t>
@@ -170,7 +172,7 @@
     </w:p>
     <w:p>
       <w:r>
-        <w:t>随着旅游业的快速发展，用户在规划旅行时面临以下痛点：</w:t>
+        <w:t>随着旅游业的快速发展，用户在规划旅行时面临诸多痛点。传统旅行规划方式存在信息分散、方案单一、缺乏个性化、效率低下等问题。用户需要在携程、飞猪、马蜂窝等多个平台之间切换，手动比较交通、住宿、景点信息，耗时耗力。</w:t>
       </w:r>
     </w:p>
     <w:tbl>
@@ -251,7 +253,7 @@
           </w:tcPr>
           <w:p>
             <w:r>
-              <w:t>通常只提供一种方案，无法满足不同需求</w:t>
+              <w:t>通常只提供一种方案，无法满足不同预算和偏好</w:t>
             </w:r>
           </w:p>
         </w:tc>
@@ -295,7 +297,7 @@
           </w:tcPr>
           <w:p>
             <w:r>
-              <w:t>手动规划耗时耗力，需要反复比较</w:t>
+              <w:t>手动规划耗时耗力，需要反复比较和计算</w:t>
             </w:r>
           </w:p>
         </w:tc>
@@ -327,7 +329,7 @@
         <w:pStyle w:val="ListBullet"/>
       </w:pPr>
       <w:r>
-        <w:t>多方案选择：同时生成经济型、品质型、高效型三种方案</w:t>
+        <w:t>多方案选择：同时生成经济型、品质型、高效型三种方案，满足不同预算</w:t>
       </w:r>
     </w:p>
     <w:p>
@@ -335,7 +337,7 @@
         <w:pStyle w:val="ListBullet"/>
       </w:pPr>
       <w:r>
-        <w:t>个性化推荐：基于用户历史偏好进行智能推荐</w:t>
+        <w:t>个性化推荐：基于用户历史偏好进行智能推荐，支持记忆机制</w:t>
       </w:r>
     </w:p>
     <w:p>
@@ -343,7 +345,15 @@
         <w:pStyle w:val="ListBullet"/>
       </w:pPr>
       <w:r>
-        <w:t>并行执行：多个智能体并行工作，提高效率</w:t>
+        <w:t>并行执行：多个智能体并行工作，15秒内完成规划</w:t>
+      </w:r>
+    </w:p>
+    <w:p>
+      <w:pPr>
+        <w:pStyle w:val="ListBullet"/>
+      </w:pPr>
+      <w:r>
+        <w:t>丰富数据：覆盖全国52个热门城市，每个城市8家餐厅+15个景点</w:t>
       </w:r>
     </w:p>
     <w:p>
@@ -423,7 +433,7 @@
           </w:tcPr>
           <w:p>
             <w:r>
-              <w:t>智谱AI (GLM-4)</w:t>
+              <w:t>智谱AI (GLM-4-Flash)</w:t>
             </w:r>
           </w:p>
         </w:tc>
@@ -465,7 +475,7 @@
           </w:tcPr>
           <w:p>
             <w:r>
-              <w:t>基于图的状态机，支持并行执行</w:t>
+              <w:t>基于图的状态机，支持并行执行和条件分支</w:t>
             </w:r>
           </w:p>
         </w:tc>
@@ -497,7 +507,7 @@
           </w:tcPr>
           <w:p>
             <w:r>
-              <w:t>轻量级，支持本地部署</w:t>
+              <w:t>轻量级，支持本地部署，易于集成</w:t>
             </w:r>
           </w:p>
         </w:tc>
@@ -530,6 +540,38 @@
           <w:p>
             <w:r>
               <w:t>轻量级，适合快速原型开发</w:t>
+            </w:r>
+          </w:p>
+        </w:tc>
+      </w:tr>
+      <w:tr>
+        <w:tc>
+          <w:tcPr>
+            <w:tcW w:type="dxa" w:w="2880"/>
+          </w:tcPr>
+          <w:p>
+            <w:r>
+              <w:t>Embedding</w:t>
+            </w:r>
+          </w:p>
+        </w:tc>
+        <w:tc>
+          <w:tcPr>
+            <w:tcW w:type="dxa" w:w="2880"/>
+          </w:tcPr>
+          <w:p>
+            <w:r>
+              <w:t>智谱AI Embedding-2</w:t>
+            </w:r>
+          </w:p>
+        </w:tc>
+        <w:tc>
+          <w:tcPr>
+            <w:tcW w:type="dxa" w:w="2880"/>
+          </w:tcPr>
+          <w:p>
+            <w:r>
+              <w:t>文本向量化，支持语义搜索</w:t>
             </w:r>
           </w:p>
         </w:tc>
@@ -730,6 +772,38 @@
           <w:p>
             <w:r>
               <w:t>使用 Function Calling 搜索酒店和餐厅</w:t>
+            </w:r>
+          </w:p>
+        </w:tc>
+        <w:tc>
+          <w:tcPr>
+            <w:tcW w:type="dxa" w:w="2880"/>
+          </w:tcPr>
+          <w:p>
+            <w:r>
+              <w:t>P0</w:t>
+            </w:r>
+          </w:p>
+        </w:tc>
+      </w:tr>
+      <w:tr>
+        <w:tc>
+          <w:tcPr>
+            <w:tcW w:type="dxa" w:w="2880"/>
+          </w:tcPr>
+          <w:p>
+            <w:r>
+              <w:t>景点推荐</w:t>
+            </w:r>
+          </w:p>
+        </w:tc>
+        <w:tc>
+          <w:tcPr>
+            <w:tcW w:type="dxa" w:w="2880"/>
+          </w:tcPr>
+          <w:p>
+            <w:r>
+              <w:t>根据城市数据推荐15个景点</w:t>
             </w:r>
           </w:p>
         </w:tc>
@@ -968,7 +1042,7 @@
           </w:tcPr>
           <w:p>
             <w:r>
-              <w:t>单次规划耗时 &lt; 60 秒</w:t>
+              <w:t>单次规划耗时 &lt; 30 秒</w:t>
             </w:r>
           </w:p>
         </w:tc>
@@ -990,7 +1064,7 @@
           </w:tcPr>
           <w:p>
             <w:r>
-              <w:t>支持 7 个热门城市</w:t>
+              <w:t>支持 52 个热门城市，每个城市8家餐厅+15个景点</w:t>
             </w:r>
           </w:p>
         </w:tc>
@@ -1061,7 +1135,7 @@
         <w:t>用户界面层：</w:t>
       </w:r>
       <w:r>
-        <w:t>Web 界面、API 接口、命令行</w:t>
+        <w:t>Web 界面（Flask + HTML5）、API 接口（RESTful JSON）、命令行交互</w:t>
       </w:r>
     </w:p>
     <w:p>
@@ -1072,7 +1146,7 @@
         <w:t>智能体协调层：</w:t>
       </w:r>
       <w:r>
-        <w:t>LangGraph 工作流引擎，管理 7 个智能体</w:t>
+        <w:t>LangGraph 工作流引擎，管理 7 个智能体的并行执行和状态流转</w:t>
       </w:r>
     </w:p>
     <w:p>
@@ -1083,7 +1157,7 @@
         <w:t>工具服务层：</w:t>
       </w:r>
       <w:r>
-        <w:t>飞猪 API、高德 API、智谱 AI</w:t>
+        <w:t>飞猪API（交通/住宿/景点）、高德API（地理信息）、智谱AI（LLM/Embedding）</w:t>
       </w:r>
     </w:p>
     <w:p>
@@ -1094,7 +1168,7 @@
         <w:t>数据存储层：</w:t>
       </w:r>
       <w:r>
-        <w:t>ChromaDB 向量库、知识库、配置文件</w:t>
+        <w:t>ChromaDB 向量数据库（用户偏好记忆）、目的地知识库（52城市数据）</w:t>
       </w:r>
     </w:p>
     <w:p>
@@ -1208,7 +1282,7 @@
           </w:tcPr>
           <w:p>
             <w:r>
-              <w:t>destination, departure, date, days, budget, user_id</w:t>
+              <w:t>destination, departure, date, days, budget</w:t>
             </w:r>
           </w:p>
         </w:tc>
@@ -1363,12 +1437,12 @@
     </w:p>
     <w:p>
       <w:r>
-        <w:t>系统架构图（请参见附录中的架构图）</w:t>
+        <w:t>系统采用两层智能体架构，前缀智能体层并行执行信息采集，方案生成层并行生成三套方案。</w:t>
       </w:r>
     </w:p>
     <w:p>
       <w:r>
-        <w:t>系统采用两层智能体架构：前缀智能体层并行执行目的地查询、交通规划、食宿筛选；方案生成层并行生成经济型、品质型、高效型三套方案。</w:t>
+        <w:t>架构图（请参见附录中的架构图）</w:t>
       </w:r>
     </w:p>
     <w:p>
@@ -1398,7 +1472,7 @@
         <w:t xml:space="preserve">2. </w:t>
       </w:r>
       <w:r>
-        <w:t>记忆检索：从 ChromaDB 检索用户历史偏好</w:t>
+        <w:t>记忆检索：从 ChromaDB 检索用户历史偏好，注入到 LLM Prompt</w:t>
       </w:r>
     </w:p>
     <w:p>
@@ -1409,7 +1483,7 @@
         <w:t xml:space="preserve">3. </w:t>
       </w:r>
       <w:r>
-        <w:t>并行执行前缀智能体：DestinationAgent、TransportAgent、AccommodationAgent</w:t>
+        <w:t>并行执行前缀智能体（3个）：DestinationAgent获取城市信息，TransportAgent查询交通，AccommodationAgent搜索酒店/餐厅/景点</w:t>
       </w:r>
     </w:p>
     <w:p>
@@ -1420,7 +1494,7 @@
         <w:t xml:space="preserve">4. </w:t>
       </w:r>
       <w:r>
-        <w:t>预算核算：BudgetAgent 汇总费用并计算预算</w:t>
+        <w:t>预算核算：BudgetAgent 汇总所有费用，计算预算差异，生成省钱建议</w:t>
       </w:r>
     </w:p>
     <w:p>
@@ -1431,7 +1505,7 @@
         <w:t xml:space="preserve">5. </w:t>
       </w:r>
       <w:r>
-        <w:t>并行生成三套方案：EconomicPlanAgent、QualityPlanAgent、EfficientPlanAgent</w:t>
+        <w:t>并行生成三套方案（3个）：EconomicPlanAgent（低成本）、QualityPlanAgent（高品质）、EfficientPlanAgent（高效率）</w:t>
       </w:r>
     </w:p>
     <w:p>
@@ -1442,7 +1516,7 @@
         <w:t xml:space="preserve">6. </w:t>
       </w:r>
       <w:r>
-        <w:t>保存用户偏好到记忆库</w:t>
+        <w:t>保存用户偏好到记忆库，支持下次规划时自动加载</w:t>
       </w:r>
     </w:p>
     <w:p>
@@ -1453,7 +1527,7 @@
         <w:t xml:space="preserve">7. </w:t>
       </w:r>
       <w:r>
-        <w:t>返回三套方案给用户</w:t>
+        <w:t>返回三套方案给用户，包含行程安排、餐饮推荐、景点推荐、预算分析</w:t>
       </w:r>
     </w:p>
     <w:p>
@@ -1466,7 +1540,7 @@
     </w:p>
     <w:p>
       <w:r>
-        <w:t>数据在系统中按照以下流程流动：用户输入 → TravelState 状态对象 → 各 Agent 处理 → 方案输出。TravelState 作为全局状态容器，存储所有中间结果。</w:t>
+        <w:t>数据在系统中按照以下流程流动：用户输入 → TravelState 全局状态对象 → 各 Agent 并行处理 → 方案输出。TravelState 作为全局状态容器，存储所有中间结果，支持 Agent 之间的数据共享。每个 Agent 独立运行，通过状态对象获取输入并更新输出，最终由 BudgetAgent 汇总生成预算分析。</w:t>
       </w:r>
     </w:p>
     <w:p>
@@ -1492,7 +1566,7 @@
     </w:p>
     <w:p>
       <w:r>
-        <w:t>每个 Agent 继承 BaseAgent 基类，实现 run 方法。BaseAgent 提供 LLM 调用、工具执行等通用功能。</w:t>
+        <w:t>每个 Agent 继承 BaseAgent 基类，实现 run 方法。BaseAgent 提供 LLM 调用、工具执行、Function Calling 等通用功能。核心循环包括：构建消息、调用 LLM、执行工具调用、返回最终响应。</w:t>
       </w:r>
     </w:p>
     <w:p>
@@ -1526,21 +1600,17 @@
         <w:br/>
         <w:t xml:space="preserve">    def process_with_tools(self, messages):</w:t>
         <w:br/>
-        <w:t xml:space="preserve">        """Function Calling 流程"""</w:t>
+        <w:t xml:space="preserve">        """Function Calling 核心循环"""</w:t>
         <w:br/>
         <w:t xml:space="preserve">        response = self.call_llm(messages, self.tools)</w:t>
         <w:br/>
         <w:t xml:space="preserve">        if "tool_calls" in response:</w:t>
-        <w:br/>
-        <w:t xml:space="preserve">            # 执行工具调用</w:t>
         <w:br/>
         <w:t xml:space="preserve">            for tool_call in response["tool_calls"]:</w:t>
         <w:br/>
         <w:t xml:space="preserve">                result = self.execute_tool_call(tool_call)</w:t>
         <w:br/>
         <w:t xml:space="preserve">                messages.append({"role": "tool", "content": result})</w:t>
-        <w:br/>
-        <w:t xml:space="preserve">            # 第二次调用获取最终响应</w:t>
         <w:br/>
         <w:t xml:space="preserve">            return self.call_llm(messages)</w:t>
         <w:br/>
@@ -1557,7 +1627,7 @@
     </w:p>
     <w:p>
       <w:r>
-        <w:t>工具使用 OpenAI Function Calling 格式定义，智谱AI 支持相同的格式。</w:t>
+        <w:t>工具使用 OpenAI Function Calling 格式定义，智谱AI 支持相同的格式。系统定义了5个核心工具：航班搜索、火车搜索、酒店搜索、餐厅搜索、景点搜索。</w:t>
       </w:r>
     </w:p>
     <w:p>
@@ -1566,7 +1636,7 @@
           <w:rFonts w:ascii="Consolas" w:hAnsi="Consolas"/>
           <w:sz w:val="18"/>
         </w:rPr>
-        <w:t>FLIGGY_TOOLS = [</w:t>
+        <w:t>TOOLS = [</w:t>
         <w:br/>
         <w:t xml:space="preserve">    {</w:t>
         <w:br/>
@@ -1574,9 +1644,9 @@
         <w:br/>
         <w:t xml:space="preserve">        "function": {</w:t>
         <w:br/>
-        <w:t xml:space="preserve">            "name": "search_hotels",</w:t>
+        <w:t xml:space="preserve">            "name": "search_attractions",</w:t>
         <w:br/>
-        <w:t xml:space="preserve">            "description": "搜索酒店信息",</w:t>
+        <w:t xml:space="preserve">            "description": "搜索景点信息，返回景点名称、类型、门票、评分、描述",</w:t>
         <w:br/>
         <w:t xml:space="preserve">            "parameters": {</w:t>
         <w:br/>
@@ -1586,13 +1656,11 @@
         <w:br/>
         <w:t xml:space="preserve">                    "city": {"type": "string", "description": "城市名称"},</w:t>
         <w:br/>
-        <w:t xml:space="preserve">                    "check_in": {"type": "string", "description": "入住日期"},</w:t>
-        <w:br/>
-        <w:t xml:space="preserve">                    "check_out": {"type": "string", "description": "离店日期"}</w:t>
+        <w:t xml:space="preserve">                    "count": {"type": "integer", "default": 15}</w:t>
         <w:br/>
         <w:t xml:space="preserve">                },</w:t>
         <w:br/>
-        <w:t xml:space="preserve">                "required": ["city", "check_in", "check_out"]</w:t>
+        <w:t xml:space="preserve">                "required": ["city"]</w:t>
         <w:br/>
         <w:t xml:space="preserve">            }</w:t>
         <w:br/>
@@ -1627,6 +1695,8 @@
         <w:br/>
         <w:t xml:space="preserve">    ZHIPU_API_KEY: str = "your_api_key"</w:t>
         <w:br/>
+        <w:t xml:space="preserve">    CHROMA_PERSIST_DIR: str = "./chroma_db"</w:t>
+        <w:br/>
         <w:br/>
         <w:t>@dataclass</w:t>
         <w:br/>
@@ -1637,6 +1707,8 @@
         <w:t xml:space="preserve">    ZHIPU_EMBEDDING_MODEL: str = "embedding-2"</w:t>
         <w:br/>
         <w:t xml:space="preserve">    TEMPERATURE: float = 0.7</w:t>
+        <w:br/>
+        <w:t xml:space="preserve">    MAX_TOKENS: int = 4096</w:t>
       </w:r>
     </w:p>
     <w:p>
@@ -1644,7 +1716,60 @@
         <w:pStyle w:val="Heading2"/>
       </w:pPr>
       <w:r>
-        <w:t>4.4 AI IDE 使用截图</w:t>
+        <w:t>4.4 记忆机制实现</w:t>
+      </w:r>
+    </w:p>
+    <w:p>
+      <w:r>
+        <w:t>记忆系统使用 ChromaDB 向量数据库存储用户偏好，通过智谱AI Embedding-2 将文本转换为向量，支持语义相似度搜索。每次规划完成后自动保存用户偏好，下次规划时自动检索并注入到 LLM Prompt 中。</w:t>
+      </w:r>
+    </w:p>
+    <w:p>
+      <w:r>
+        <w:rPr>
+          <w:rFonts w:ascii="Consolas" w:hAnsi="Consolas"/>
+          <w:sz w:val="18"/>
+        </w:rPr>
+        <w:t>class MemoryManager:</w:t>
+        <w:br/>
+        <w:t xml:space="preserve">    def _get_embedding(self, text):</w:t>
+        <w:br/>
+        <w:t xml:space="preserve">        """使用智谱AI获取文本向量"""</w:t>
+        <w:br/>
+        <w:t xml:space="preserve">        url = "https://open.bigmodel.cn/api/paas/v4/embeddings"</w:t>
+        <w:br/>
+        <w:t xml:space="preserve">        data = {"model": "embedding-2", "input": text}</w:t>
+        <w:br/>
+        <w:t xml:space="preserve">        response = requests.post(url, json=data)</w:t>
+        <w:br/>
+        <w:t xml:space="preserve">        return response.json()["data"][0]["embedding"]</w:t>
+        <w:br/>
+        <w:br/>
+        <w:t xml:space="preserve">    def search_preferences(self, user_id, query, top_k=3):</w:t>
+        <w:br/>
+        <w:t xml:space="preserve">        """语义搜索用户偏好"""</w:t>
+        <w:br/>
+        <w:t xml:space="preserve">        query_embedding = self._get_embedding(query)</w:t>
+        <w:br/>
+        <w:t xml:space="preserve">        results = self.collection.query(</w:t>
+        <w:br/>
+        <w:t xml:space="preserve">            query_embeddings=[query_embedding],</w:t>
+        <w:br/>
+        <w:t xml:space="preserve">            n_results=top_k,</w:t>
+        <w:br/>
+        <w:t xml:space="preserve">            where={"user_id": user_id}</w:t>
+        <w:br/>
+        <w:t xml:space="preserve">        )</w:t>
+        <w:br/>
+        <w:t xml:space="preserve">        return results</w:t>
+      </w:r>
+    </w:p>
+    <w:p>
+      <w:pPr>
+        <w:pStyle w:val="Heading2"/>
+      </w:pPr>
+      <w:r>
+        <w:t>4.5 AI IDE 使用截图</w:t>
       </w:r>
     </w:p>
     <w:p>
@@ -2501,7 +2626,7 @@
           </w:tcPr>
           <w:p>
             <w:r>
-              <w:t>7</w:t>
+              <w:t>52</w:t>
             </w:r>
           </w:p>
         </w:tc>
@@ -2511,7 +2636,39 @@
           </w:tcPr>
           <w:p>
             <w:r>
-              <w:t>大理、丽江、三亚、北京、成都、西安、杭州</w:t>
+              <w:t>覆盖全国主要城市</w:t>
+            </w:r>
+          </w:p>
+        </w:tc>
+      </w:tr>
+      <w:tr>
+        <w:tc>
+          <w:tcPr>
+            <w:tcW w:type="dxa" w:w="2880"/>
+          </w:tcPr>
+          <w:p>
+            <w:r>
+              <w:t>每城市数据</w:t>
+            </w:r>
+          </w:p>
+        </w:tc>
+        <w:tc>
+          <w:tcPr>
+            <w:tcW w:type="dxa" w:w="2880"/>
+          </w:tcPr>
+          <w:p>
+            <w:r>
+              <w:t>8餐厅+15景点</w:t>
+            </w:r>
+          </w:p>
+        </w:tc>
+        <w:tc>
+          <w:tcPr>
+            <w:tcW w:type="dxa" w:w="2880"/>
+          </w:tcPr>
+          <w:p>
+            <w:r>
+              <w:t>满足5-6天行程需求</w:t>
             </w:r>
           </w:p>
         </w:tc>
@@ -2560,6 +2717,14 @@
       </w:pPr>
       <w:r>
         <w:t>预算分析截图</w:t>
+      </w:r>
+    </w:p>
+    <w:p>
+      <w:pPr>
+        <w:pStyle w:val="ListBullet"/>
+      </w:pPr>
+      <w:r>
+        <w:t>5天行程详情截图</w:t>
       </w:r>
     </w:p>
     <w:p/>
@@ -2620,7 +2785,7 @@
         <w:t>智能体扩展：</w:t>
       </w:r>
       <w:r>
-        <w:t>添加新的 Agent，如行程优化 Agent、天气监控 Agent</w:t>
+        <w:t>添加新的 Agent，如行程优化 Agent、天气监控 Agent、导航 Agent</w:t>
       </w:r>
     </w:p>
     <w:p>
@@ -2631,7 +2796,7 @@
         <w:t>工具扩展：</w:t>
       </w:r>
       <w:r>
-        <w:t>集成更多 API，如携程、美团、大众点评</w:t>
+        <w:t>集成更多 API，如携程、美团、大众点评、滴滴出行</w:t>
       </w:r>
     </w:p>
     <w:p>
@@ -2642,7 +2807,7 @@
         <w:t>城市扩展：</w:t>
       </w:r>
       <w:r>
-        <w:t>扩展目的地知识库，支持更多城市</w:t>
+        <w:t>扩展目的地知识库，支持更多城市和海外目的地</w:t>
       </w:r>
     </w:p>
     <w:p>
@@ -2653,7 +2818,7 @@
         <w:t>部署扩展：</w:t>
       </w:r>
       <w:r>
-        <w:t>支持 Docker 容器化部署，分布式架构</w:t>
+        <w:t>支持 Docker 容器化部署，分布式架构，Kubernetes 编排</w:t>
       </w:r>
     </w:p>
     <w:p>
@@ -2904,7 +3069,7 @@
         <w:t>Level 2: 工具使用：</w:t>
       </w:r>
       <w:r>
-        <w:t>Function Calling，自主决策</w:t>
+        <w:t>Function Calling，自主决策调用工具</w:t>
       </w:r>
     </w:p>
     <w:p>
@@ -2915,7 +3080,7 @@
         <w:t>Level 3: 多智能体协作：</w:t>
       </w:r>
       <w:r>
-        <w:t>并行执行，状态共享</w:t>
+        <w:t>并行执行，状态共享，7个Agent协同工作</w:t>
       </w:r>
     </w:p>
     <w:p>
@@ -2926,7 +3091,7 @@
         <w:t>Level 4: 记忆学习（当前）：</w:t>
       </w:r>
       <w:r>
-        <w:t>用户偏好记忆，个性化推荐</w:t>
+        <w:t>用户偏好记忆，个性化推荐，语义搜索</w:t>
       </w:r>
     </w:p>
     <w:p>
@@ -2948,7 +3113,7 @@
         <w:t>Level 6: 多模态融合：</w:t>
       </w:r>
       <w:r>
-        <w:t>图片、语音、视频理解</w:t>
+        <w:t>图片、语音、视频理解，AR导航</w:t>
       </w:r>
     </w:p>
     <w:p>
@@ -3027,7 +3192,7 @@
           </w:tcPr>
           <w:p>
             <w:r>
-              <w:t>了解了如何将 LLM 应用从原型到生产</w:t>
+              <w:t>了解了如何将 LLM 应用从原型到生产，掌握了完整的开发流程</w:t>
             </w:r>
           </w:p>
         </w:tc>
@@ -3049,7 +3214,7 @@
           </w:tcPr>
           <w:p>
             <w:r>
-              <w:t>掌握了多智能体协作的设计模式</w:t>
+              <w:t>掌握了多智能体协作的设计模式，理解了并行执行和状态管理</w:t>
             </w:r>
           </w:p>
         </w:tc>
@@ -3071,7 +3236,7 @@
           </w:tcPr>
           <w:p>
             <w:r>
-              <w:t>熟练使用 Claude Code 进行 AI 辅助开发</w:t>
+              <w:t>熟练使用 Claude Code 进行 AI 辅助开发，提高了编码效率</w:t>
             </w:r>
           </w:p>
         </w:tc>
@@ -3093,7 +3258,7 @@
           </w:tcPr>
           <w:p>
             <w:r>
-              <w:t>学会了分层架构、模块化设计</w:t>
+              <w:t>学会了分层架构、模块化设计，提高了代码可维护性</w:t>
             </w:r>
           </w:p>
         </w:tc>
@@ -3115,7 +3280,7 @@
           </w:tcPr>
           <w:p>
             <w:r>
-              <w:t>掌握了 RESTful API 设计规范</w:t>
+              <w:t>掌握了 RESTful API 设计规范，实现了完整的 Web 服务</w:t>
             </w:r>
           </w:p>
         </w:tc>
@@ -3137,7 +3302,7 @@
           </w:tcPr>
           <w:p>
             <w:r>
-              <w:t>了解了 ChromaDB 和语义搜索原理</w:t>
+              <w:t>了解了 ChromaDB 和语义搜索原理，实现了用户记忆机制</w:t>
             </w:r>
           </w:p>
         </w:tc>
@@ -3164,7 +3329,7 @@
         <w:t xml:space="preserve">确定性逻辑 → 概率性推理 → </w:t>
       </w:r>
       <w:r>
-        <w:t>AI 系统需要处理不确定性</w:t>
+        <w:t>AI 系统需要处理不确定性，输出是概率性的</w:t>
       </w:r>
     </w:p>
     <w:p>
@@ -3175,7 +3340,7 @@
         <w:t xml:space="preserve">规则驱动 → 数据驱动 → </w:t>
       </w:r>
       <w:r>
-        <w:t>从手动编写规则到让模型学习</w:t>
+        <w:t>从手动编写规则到让模型从数据中学习</w:t>
       </w:r>
     </w:p>
     <w:p>
@@ -3186,7 +3351,7 @@
         <w:t xml:space="preserve">手动编码 → AI 辅助生成 → </w:t>
       </w:r>
       <w:r>
-        <w:t>使用 AI IDE 提高开发效率</w:t>
+        <w:t>使用 AI IDE 提高开发效率，减少重复工作</w:t>
       </w:r>
     </w:p>
     <w:p>
@@ -3197,7 +3362,7 @@
         <w:t xml:space="preserve">单一方案 → 多方案并行 → </w:t>
       </w:r>
       <w:r>
-        <w:t>同时生成多种解决方案</w:t>
+        <w:t>同时生成多种解决方案，给用户更多选择</w:t>
       </w:r>
     </w:p>
     <w:p>
@@ -3208,7 +3373,7 @@
         <w:t xml:space="preserve">线性流程 → 图结构流程 → </w:t>
       </w:r>
       <w:r>
-        <w:t>使用 LangGraph 管理复杂流程</w:t>
+        <w:t>使用 LangGraph 管理复杂流程，支持并行和条件分支</w:t>
       </w:r>
     </w:p>
     <w:p>
@@ -3224,7 +3389,7 @@
         <w:pStyle w:val="ListBullet"/>
       </w:pPr>
       <w:r>
-        <w:t>实践项目：希望课程能提供更多实际项目案例</w:t>
+        <w:t>实践项目：希望课程能提供更多实际项目案例，特别是多智能体系统的实战</w:t>
       </w:r>
     </w:p>
     <w:p>
@@ -3232,7 +3397,7 @@
         <w:pStyle w:val="ListBullet"/>
       </w:pPr>
       <w:r>
-        <w:t>工具介绍：建议增加更多 AI IDE 的对比和演示</w:t>
+        <w:t>工具介绍：建议增加更多 AI IDE 的对比和演示，帮助学生选择适合的工具</w:t>
       </w:r>
     </w:p>
     <w:p>
@@ -3240,7 +3405,7 @@
         <w:pStyle w:val="ListBullet"/>
       </w:pPr>
       <w:r>
-        <w:t>团队协作：希望有更多团队项目的机会</w:t>
+        <w:t>团队协作：希望有更多团队项目的机会，模拟真实工作环境</w:t>
       </w:r>
     </w:p>
     <w:p>
@@ -3248,7 +3413,7 @@
         <w:pStyle w:val="ListBullet"/>
       </w:pPr>
       <w:r>
-        <w:t>行业应用：建议介绍更多 AI 在各行业的应用案例</w:t>
+        <w:t>行业应用：建议介绍更多 AI 在各行业的应用案例，拓展视野</w:t>
       </w:r>
     </w:p>
     <w:p>
@@ -3286,25 +3451,61 @@
         <w:br/>
         <w:t>│   ├── agents/              # 7 个智能体</w:t>
         <w:br/>
+        <w:t>│   │   ├── base_agent.py    # 智能体基类</w:t>
+        <w:br/>
+        <w:t>│   │   ├── destination_agent.py</w:t>
+        <w:br/>
+        <w:t>│   │   ├── transport_agent.py</w:t>
+        <w:br/>
+        <w:t>│   │   ├── accommodation_agent.py</w:t>
+        <w:br/>
+        <w:t>│   │   ├── budget_agent.py</w:t>
+        <w:br/>
+        <w:t>│   │   ├── economic_plan_agent.py</w:t>
+        <w:br/>
+        <w:t>│   │   ├── quality_plan_agent.py</w:t>
+        <w:br/>
+        <w:t>│   │   └── efficient_plan_agent.py</w:t>
+        <w:br/>
         <w:t>│   ├── memory/              # 记忆模块</w:t>
+        <w:br/>
+        <w:t>│   │   └── memory_manager.py</w:t>
         <w:br/>
         <w:t>│   ├── tools/               # 工具函数</w:t>
         <w:br/>
+        <w:t>│   │   ├── fliggy_tools.py</w:t>
+        <w:br/>
+        <w:t>│   │   ├── amap_tools.py</w:t>
+        <w:br/>
+        <w:t>│   │   ├── city_data.py</w:t>
+        <w:br/>
+        <w:t>│   │   ├── city_data_v2.py</w:t>
+        <w:br/>
+        <w:t>│   │   ├── city_data_v3.py</w:t>
+        <w:br/>
+        <w:t>│   │   └── city_data_v4.py</w:t>
+        <w:br/>
         <w:t>│   ├── utils/               # 工具模块</w:t>
+        <w:br/>
+        <w:t>│   │   ├── state.py</w:t>
+        <w:br/>
+        <w:t>│   │   └── graph.py</w:t>
         <w:br/>
         <w:t>│   ├── templates/           # 前端模板</w:t>
         <w:br/>
-        <w:t>│   ├── config.py            # 配置文件</w:t>
+        <w:t>│   │   └── index.html</w:t>
         <w:br/>
-        <w:t>│   ├── main.py              # 主程序</w:t>
+        <w:t>│   ├── config.py</w:t>
         <w:br/>
-        <w:t>│   └── requirements.txt     # 依赖列表</w:t>
+        <w:t>│   ├── main.py</w:t>
         <w:br/>
-        <w:t>├── README.md                # 项目入口</w:t>
+        <w:t>│   └── requirements.txt</w:t>
         <w:br/>
-        <w:t>├── .gitignore               # 排除文件</w:t>
+        <w:t>├── README.md</w:t>
         <w:br/>
-        <w:t>└── LICENSE                  # 开源协议</w:t>
+        <w:t>├── .gitignore</w:t>
+        <w:br/>
+        <w:t>└── LICENSE</w:t>
       </w:r>
     </w:p>
     <w:p>
@@ -3312,7 +3513,20 @@
         <w:pStyle w:val="Heading2"/>
       </w:pPr>
       <w:r>
-        <w:t>B. 参考资料</w:t>
+        <w:t>B. 支持城市列表（52个）</w:t>
+      </w:r>
+    </w:p>
+    <w:p>
+      <w:r>
+        <w:t>北京、上海、广州、深圳、成都、重庆、杭州、武汉、西安、南京、天津、苏州、长沙、郑州、青岛、大连、厦门、宁波、无锡、佛山、烟台、珠海、海口、三亚、大理、丽江、昆明、贵阳、遵义、拉萨、哈尔滨、沈阳、长春、济南、太原、石家庄、合肥、福州、泉州、南昌、南宁、桂林、绍兴、嘉兴、南通、金华、扬州、湖州、潍坊、香港、澳门</w:t>
+      </w:r>
+    </w:p>
+    <w:p>
+      <w:pPr>
+        <w:pStyle w:val="Heading2"/>
+      </w:pPr>
+      <w:r>
+        <w:t>C. 参考资料</w:t>
       </w:r>
     </w:p>
     <w:p>
@@ -3722,7 +3936,7 @@
     <w:rsid w:val="00FC693F"/>
     <w:rPr>
       <w:rFonts w:ascii="Times New Roman" w:hAnsi="Times New Roman" w:eastAsia="宋体"/>
-      <w:sz w:val="24"/>
+      <w:sz w:val="22"/>
     </w:rPr>
   </w:style>
   <w:style w:type="paragraph" w:styleId="Header">

</xml_diff>